<commit_message>
Hawthorn Rd VP523438: Rev G with drone photogrammetry capability
Co-Authored-By: Claude Opus 5.5 <noreply@anthropic.com>
Claude-Session: https://claude.ai/code/session_01RKGFyarCMuMinKYL7AiBap
</commit_message>
<xml_diff>
--- a/FP/VP527819/Final/IWC Transport Condition Audit_Reval RFT 47-26 Returnable Documents_JCE_FILLED_RevG.docx
+++ b/FP/VP527819/Final/IWC Transport Condition Audit_Reval RFT 47-26 Returnable Documents_JCE_FILLED_RevG.docx
@@ -3446,6 +3446,21 @@
       </w:r>
       <w:r>
         <w:t>Civil design and design management, roads and pavements, stormwater and flooding, water and sewer, construction-phase inspection and quality assurance, engineer's estimates and bills of quantities, Civil 3D and GIS data management.</w:t>
+      </w:r>
+    </w:p>
+    <w:p>
+      <w:pPr>
+        <w:pStyle w:val="ListBullet"/>
+        <w:spacing w:after="40"/>
+      </w:pPr>
+      <w:r>
+        <w:rPr>
+          <w:b/>
+        </w:rPr>
+        <w:t xml:space="preserve">Related capability and equipment: </w:t>
+      </w:r>
+      <w:r>
+        <w:t>JCE's related business, Glide Inside (glideinside.com.au), produces 3D digital models and visualisation for the property and construction sector. JCE offers drone photogrammetry (orthophotos, 3D models and geotagged inspection imagery) using a DJI Mavic 3 Enterprise with RTK, operated under CASA's sub-2 kg excluded category, with operator accreditation in place before services start. On this contract that capability is limited to the optional per-site rate (Item 10) for a specific asset outside 5.5 km of Sydney and Bankstown airports and clear of people; it is not used for network capture (Section 2.1).</w:t>
       </w:r>
     </w:p>
     <w:p>

</xml_diff>